<commit_message>
Add ER diagram to project reports and PowerPoint slides
</commit_message>
<xml_diff>
--- a/Aether_Academy_Project_Report.docx
+++ b/Aether_Academy_Project_Report.docx
@@ -2863,6 +2863,60 @@
     </w:p>
     <w:p>
       <w:pPr>
+        <w:spacing w:before="200" w:after="80"/>
+        <w:jc w:val="center"/>
+      </w:pPr>
+      <w:r>
+        <w:drawing>
+          <wp:inline xmlns:a="http://schemas.openxmlformats.org/drawingml/2006/main" xmlns:pic="http://schemas.openxmlformats.org/drawingml/2006/picture">
+            <wp:extent cx="5120640" cy="2782558"/>
+            <wp:docPr id="2" name="Picture 2"/>
+            <wp:cNvGraphicFramePr>
+              <a:graphicFrameLocks noChangeAspect="1"/>
+            </wp:cNvGraphicFramePr>
+            <a:graphic>
+              <a:graphicData uri="http://schemas.openxmlformats.org/drawingml/2006/picture">
+                <pic:pic>
+                  <pic:nvPicPr>
+                    <pic:cNvPr id="0" name="er_diagram.png"/>
+                    <pic:cNvPicPr/>
+                  </pic:nvPicPr>
+                  <pic:blipFill>
+                    <a:blip r:embed="rId12"/>
+                    <a:stretch>
+                      <a:fillRect/>
+                    </a:stretch>
+                  </pic:blipFill>
+                  <pic:spPr>
+                    <a:xfrm>
+                      <a:off x="0" y="0"/>
+                      <a:ext cx="5120640" cy="2782558"/>
+                    </a:xfrm>
+                    <a:prstGeom prst="rect"/>
+                  </pic:spPr>
+                </pic:pic>
+              </a:graphicData>
+            </a:graphic>
+          </wp:inline>
+        </w:drawing>
+      </w:r>
+    </w:p>
+    <w:p>
+      <w:pPr>
+        <w:spacing w:before="40" w:after="240"/>
+        <w:jc w:val="center"/>
+      </w:pPr>
+      <w:r>
+        <w:rPr>
+          <w:i/>
+          <w:color w:val="4B5563"/>
+          <w:sz w:val="19"/>
+        </w:rPr>
+        <w:t>Figure 5.1: Normalized Entity-Relationship (ER) Architecture &amp; Cardinality Mapping.</w:t>
+      </w:r>
+    </w:p>
+    <w:p>
+      <w:pPr>
         <w:pStyle w:val="Heading2"/>
         <w:keepNext/>
         <w:spacing w:before="280" w:after="120"/>
@@ -3041,7 +3095,7 @@
         <w:drawing>
           <wp:inline xmlns:a="http://schemas.openxmlformats.org/drawingml/2006/main" xmlns:pic="http://schemas.openxmlformats.org/drawingml/2006/picture">
             <wp:extent cx="5120640" cy="5257104"/>
-            <wp:docPr id="2" name="Picture 2"/>
+            <wp:docPr id="3" name="Picture 3"/>
             <wp:cNvGraphicFramePr>
               <a:graphicFrameLocks noChangeAspect="1"/>
             </wp:cNvGraphicFramePr>
@@ -3053,7 +3107,7 @@
                     <pic:cNvPicPr/>
                   </pic:nvPicPr>
                   <pic:blipFill>
-                    <a:blip r:embed="rId12"/>
+                    <a:blip r:embed="rId13"/>
                     <a:stretch>
                       <a:fillRect/>
                     </a:stretch>
@@ -3095,7 +3149,7 @@
         <w:drawing>
           <wp:inline xmlns:a="http://schemas.openxmlformats.org/drawingml/2006/main" xmlns:pic="http://schemas.openxmlformats.org/drawingml/2006/picture">
             <wp:extent cx="5120640" cy="5749491"/>
-            <wp:docPr id="3" name="Picture 3"/>
+            <wp:docPr id="4" name="Picture 4"/>
             <wp:cNvGraphicFramePr>
               <a:graphicFrameLocks noChangeAspect="1"/>
             </wp:cNvGraphicFramePr>
@@ -3107,7 +3161,7 @@
                     <pic:cNvPicPr/>
                   </pic:nvPicPr>
                   <pic:blipFill>
-                    <a:blip r:embed="rId13"/>
+                    <a:blip r:embed="rId14"/>
                     <a:stretch>
                       <a:fillRect/>
                     </a:stretch>
@@ -3149,7 +3203,7 @@
         <w:drawing>
           <wp:inline xmlns:a="http://schemas.openxmlformats.org/drawingml/2006/main" xmlns:pic="http://schemas.openxmlformats.org/drawingml/2006/picture">
             <wp:extent cx="5120640" cy="2678159"/>
-            <wp:docPr id="4" name="Picture 4"/>
+            <wp:docPr id="5" name="Picture 5"/>
             <wp:cNvGraphicFramePr>
               <a:graphicFrameLocks noChangeAspect="1"/>
             </wp:cNvGraphicFramePr>
@@ -3161,7 +3215,7 @@
                     <pic:cNvPicPr/>
                   </pic:nvPicPr>
                   <pic:blipFill>
-                    <a:blip r:embed="rId14"/>
+                    <a:blip r:embed="rId15"/>
                     <a:stretch>
                       <a:fillRect/>
                     </a:stretch>
@@ -3203,7 +3257,7 @@
         <w:drawing>
           <wp:inline xmlns:a="http://schemas.openxmlformats.org/drawingml/2006/main" xmlns:pic="http://schemas.openxmlformats.org/drawingml/2006/picture">
             <wp:extent cx="5120640" cy="4416552"/>
-            <wp:docPr id="5" name="Picture 5"/>
+            <wp:docPr id="6" name="Picture 6"/>
             <wp:cNvGraphicFramePr>
               <a:graphicFrameLocks noChangeAspect="1"/>
             </wp:cNvGraphicFramePr>
@@ -3215,7 +3269,7 @@
                     <pic:cNvPicPr/>
                   </pic:nvPicPr>
                   <pic:blipFill>
-                    <a:blip r:embed="rId15"/>
+                    <a:blip r:embed="rId16"/>
                     <a:stretch>
                       <a:fillRect/>
                     </a:stretch>
@@ -3257,7 +3311,7 @@
         <w:drawing>
           <wp:inline xmlns:a="http://schemas.openxmlformats.org/drawingml/2006/main" xmlns:pic="http://schemas.openxmlformats.org/drawingml/2006/picture">
             <wp:extent cx="5120640" cy="2410301"/>
-            <wp:docPr id="6" name="Picture 6"/>
+            <wp:docPr id="7" name="Picture 7"/>
             <wp:cNvGraphicFramePr>
               <a:graphicFrameLocks noChangeAspect="1"/>
             </wp:cNvGraphicFramePr>
@@ -3269,7 +3323,7 @@
                     <pic:cNvPicPr/>
                   </pic:nvPicPr>
                   <pic:blipFill>
-                    <a:blip r:embed="rId16"/>
+                    <a:blip r:embed="rId17"/>
                     <a:stretch>
                       <a:fillRect/>
                     </a:stretch>

</xml_diff>